<commit_message>
fix: resolve schema compatibility issues in backend and frontend
- accounting.py: Use invoices.gst_amount instead of non-existent gst table
- invoices.py: Fix reserve_number linking, add subtotal_taxable/non_taxable/gst_amount fields, add paid bool flag
- cheque_books.py: Use NULLIF(REGEXP_REPLACE()) for safe cheque number extraction
- received_payments.py: Remove non-existent deposit_type column reference
- pdf.py: Handle optional charters.payment_method and payments.deleted_at columns
- charter_form_widget.py: State tracking for widget
- Accounting/Admin/Charter/ChequeBookManagement/ReceivedPayments Vue views: Frontend schema updates
- db.py, main.py, multiple routers: Schema compatibility layer updates
</commit_message>
<xml_diff>
--- a/tmp/confirmation_letter_TEMPLATE.docx
+++ b/tmp/confirmation_letter_TEMPLATE.docx
@@ -96,31 +96,7 @@
         <w:rPr>
           <w:sz w:val="17"/>
         </w:rPr>
-        <w:t>,</w:t>
-      </w:r>
-      <w:r>
-        <w:rPr>
-          <w:sz w:val="17"/>
-        </w:rPr>
-        <w:t xml:space="preserve"> Red Deer</w:t>
-      </w:r>
-      <w:r>
-        <w:rPr>
-          <w:sz w:val="17"/>
-        </w:rPr>
-        <w:t xml:space="preserve"> County</w:t>
-      </w:r>
-      <w:r>
-        <w:rPr>
-          <w:sz w:val="17"/>
-        </w:rPr>
-        <w:t>, A</w:t>
-      </w:r>
-      <w:r>
-        <w:rPr>
-          <w:sz w:val="17"/>
-        </w:rPr>
-        <w:t xml:space="preserve">B, </w:t>
+        <w:t xml:space="preserve">, Red Deer County, AB, </w:t>
       </w:r>
       <w:r>
         <w:rPr>
@@ -3194,6 +3170,7 @@
   <w:style w:type="character" w:default="1" w:styleId="DefaultParagraphFont">
     <w:name w:val="Default Paragraph Font"/>
     <w:uiPriority w:val="1"/>
+    <w:semiHidden/>
     <w:unhideWhenUsed/>
   </w:style>
   <w:style w:type="table" w:default="1" w:styleId="TableNormal">

</xml_diff>